<commit_message>
Release 38: housekeeping (HK-5) - start.sh corrected, Cyprus Greek premises line, admin_clear and api removed, run time in Help
Co-Authored-By: Claude Opus 5 <noreply@anthropic.com>
</commit_message>
<xml_diff>
--- a/pages/templates/lease_templates/cyprus_greek_lease_template.docx
+++ b/pages/templates/lease_templates/cyprus_greek_lease_template.docx
@@ -1379,381 +1379,39 @@
           <w:szCs w:val="20"/>
           <w:lang w:val="en-US"/>
         </w:rPr>
-        <w:t>{{ property</w:t>
+        <w:t>{{ property_address_line_greek }}</w:t>
       </w:r>
       <w:proofErr w:type="gramEnd"/>
-      <w:r>
-        <w:rPr>
-          <w:rFonts w:ascii="Trebuchet MS" w:hAnsi="Trebuchet MS"/>
-          <w:sz w:val="20"/>
-          <w:szCs w:val="20"/>
-          <w:lang w:val="en-US"/>
-        </w:rPr>
-        <w:t>_address1</w:t>
-      </w:r>
-      <w:r>
-        <w:rPr>
-          <w:rFonts w:ascii="Trebuchet MS" w:hAnsi="Trebuchet MS"/>
-          <w:sz w:val="20"/>
-          <w:szCs w:val="20"/>
-          <w:lang w:val="en-US"/>
-        </w:rPr>
-        <w:t>_</w:t>
-      </w:r>
       <w:proofErr w:type="gramStart"/>
-      <w:r>
-        <w:rPr>
-          <w:rFonts w:ascii="Trebuchet MS" w:hAnsi="Trebuchet MS"/>
-          <w:sz w:val="20"/>
-          <w:szCs w:val="20"/>
-          <w:lang w:val="en-US"/>
-        </w:rPr>
-        <w:t>greek</w:t>
-      </w:r>
-      <w:r>
-        <w:rPr>
-          <w:rFonts w:ascii="Trebuchet MS" w:hAnsi="Trebuchet MS"/>
-          <w:sz w:val="20"/>
-          <w:szCs w:val="20"/>
-          <w:lang w:val="en-US"/>
-        </w:rPr>
-        <w:t xml:space="preserve"> }</w:t>
-      </w:r>
       <w:proofErr w:type="gramEnd"/>
-      <w:r>
-        <w:rPr>
-          <w:rFonts w:ascii="Trebuchet MS" w:hAnsi="Trebuchet MS"/>
-          <w:sz w:val="20"/>
-          <w:szCs w:val="20"/>
-          <w:lang w:val="en-US"/>
-        </w:rPr>
-        <w:t xml:space="preserve">}, </w:t>
-      </w:r>
       <w:proofErr w:type="gramStart"/>
-      <w:r>
-        <w:rPr>
-          <w:rFonts w:ascii="Trebuchet MS" w:hAnsi="Trebuchet MS"/>
-          <w:sz w:val="20"/>
-          <w:szCs w:val="20"/>
-          <w:lang w:val="en-US"/>
-        </w:rPr>
-        <w:t>{{ property</w:t>
-      </w:r>
       <w:proofErr w:type="gramEnd"/>
-      <w:r>
-        <w:rPr>
-          <w:rFonts w:ascii="Trebuchet MS" w:hAnsi="Trebuchet MS"/>
-          <w:sz w:val="20"/>
-          <w:szCs w:val="20"/>
-          <w:lang w:val="en-US"/>
-        </w:rPr>
-        <w:t>_address2</w:t>
-      </w:r>
-      <w:r>
-        <w:rPr>
-          <w:rFonts w:ascii="Trebuchet MS" w:hAnsi="Trebuchet MS"/>
-          <w:sz w:val="20"/>
-          <w:szCs w:val="20"/>
-          <w:lang w:val="en-US"/>
-        </w:rPr>
-        <w:t>_</w:t>
-      </w:r>
       <w:proofErr w:type="gramStart"/>
-      <w:r>
-        <w:rPr>
-          <w:rFonts w:ascii="Trebuchet MS" w:hAnsi="Trebuchet MS"/>
-          <w:sz w:val="20"/>
-          <w:szCs w:val="20"/>
-          <w:lang w:val="en-US"/>
-        </w:rPr>
-        <w:t>greek</w:t>
-      </w:r>
-      <w:r>
-        <w:rPr>
-          <w:rFonts w:ascii="Trebuchet MS" w:hAnsi="Trebuchet MS"/>
-          <w:sz w:val="20"/>
-          <w:szCs w:val="20"/>
-          <w:lang w:val="en-US"/>
-        </w:rPr>
-        <w:t xml:space="preserve"> }</w:t>
-      </w:r>
       <w:proofErr w:type="gramEnd"/>
-      <w:r>
-        <w:rPr>
-          <w:rFonts w:ascii="Trebuchet MS" w:hAnsi="Trebuchet MS"/>
-          <w:sz w:val="20"/>
-          <w:szCs w:val="20"/>
-          <w:lang w:val="en-US"/>
-        </w:rPr>
-        <w:t xml:space="preserve">}, </w:t>
-      </w:r>
       <w:proofErr w:type="gramStart"/>
-      <w:r>
-        <w:rPr>
-          <w:rFonts w:ascii="Trebuchet MS" w:hAnsi="Trebuchet MS"/>
-          <w:sz w:val="20"/>
-          <w:szCs w:val="20"/>
-          <w:lang w:val="en-US"/>
-        </w:rPr>
-        <w:t xml:space="preserve">{{ </w:t>
-      </w:r>
-      <w:proofErr w:type="spellStart"/>
-      <w:r>
-        <w:rPr>
-          <w:rFonts w:ascii="Trebuchet MS" w:hAnsi="Trebuchet MS"/>
-          <w:sz w:val="20"/>
-          <w:szCs w:val="20"/>
-          <w:lang w:val="en-US"/>
-        </w:rPr>
-        <w:t>property</w:t>
-      </w:r>
+      <w:proofErr w:type="spellStart"/>
       <w:proofErr w:type="gramEnd"/>
-      <w:r>
-        <w:rPr>
-          <w:rFonts w:ascii="Trebuchet MS" w:hAnsi="Trebuchet MS"/>
-          <w:sz w:val="20"/>
-          <w:szCs w:val="20"/>
-          <w:lang w:val="en-US"/>
-        </w:rPr>
-        <w:t>_suburb</w:t>
-      </w:r>
-      <w:r>
-        <w:rPr>
-          <w:rFonts w:ascii="Trebuchet MS" w:hAnsi="Trebuchet MS"/>
-          <w:sz w:val="20"/>
-          <w:szCs w:val="20"/>
-          <w:lang w:val="en-US"/>
-        </w:rPr>
-        <w:t>_</w:t>
-      </w:r>
       <w:proofErr w:type="gramStart"/>
-      <w:r>
-        <w:rPr>
-          <w:rFonts w:ascii="Trebuchet MS" w:hAnsi="Trebuchet MS"/>
-          <w:sz w:val="20"/>
-          <w:szCs w:val="20"/>
-          <w:lang w:val="en-US"/>
-        </w:rPr>
-        <w:t>greek</w:t>
-      </w:r>
-      <w:proofErr w:type="spellEnd"/>
-      <w:r>
-        <w:rPr>
-          <w:rFonts w:ascii="Trebuchet MS" w:hAnsi="Trebuchet MS"/>
-          <w:sz w:val="20"/>
-          <w:szCs w:val="20"/>
-          <w:lang w:val="en-US"/>
-        </w:rPr>
-        <w:t xml:space="preserve"> }</w:t>
-      </w:r>
+      <w:proofErr w:type="spellEnd"/>
       <w:proofErr w:type="gramEnd"/>
-      <w:r>
-        <w:rPr>
-          <w:rFonts w:ascii="Trebuchet MS" w:hAnsi="Trebuchet MS"/>
-          <w:sz w:val="20"/>
-          <w:szCs w:val="20"/>
-          <w:lang w:val="en-US"/>
-        </w:rPr>
-        <w:t xml:space="preserve">}, </w:t>
-      </w:r>
       <w:proofErr w:type="gramStart"/>
-      <w:r>
-        <w:rPr>
-          <w:rFonts w:ascii="Trebuchet MS" w:hAnsi="Trebuchet MS"/>
-          <w:sz w:val="20"/>
-          <w:szCs w:val="20"/>
-          <w:lang w:val="en-US"/>
-        </w:rPr>
-        <w:t xml:space="preserve">{{ </w:t>
-      </w:r>
-      <w:proofErr w:type="spellStart"/>
-      <w:r>
-        <w:rPr>
-          <w:rFonts w:ascii="Trebuchet MS" w:hAnsi="Trebuchet MS"/>
-          <w:sz w:val="20"/>
-          <w:szCs w:val="20"/>
-          <w:lang w:val="en-US"/>
-        </w:rPr>
-        <w:t>property</w:t>
-      </w:r>
+      <w:proofErr w:type="spellStart"/>
       <w:proofErr w:type="gramEnd"/>
-      <w:r>
-        <w:rPr>
-          <w:rFonts w:ascii="Trebuchet MS" w:hAnsi="Trebuchet MS"/>
-          <w:sz w:val="20"/>
-          <w:szCs w:val="20"/>
-          <w:lang w:val="en-US"/>
-        </w:rPr>
-        <w:t>_city</w:t>
-      </w:r>
-      <w:r>
-        <w:rPr>
-          <w:rFonts w:ascii="Trebuchet MS" w:hAnsi="Trebuchet MS"/>
-          <w:sz w:val="20"/>
-          <w:szCs w:val="20"/>
-          <w:lang w:val="en-US"/>
-        </w:rPr>
-        <w:t>_</w:t>
-      </w:r>
       <w:proofErr w:type="gramStart"/>
-      <w:r>
-        <w:rPr>
-          <w:rFonts w:ascii="Trebuchet MS" w:hAnsi="Trebuchet MS"/>
-          <w:sz w:val="20"/>
-          <w:szCs w:val="20"/>
-          <w:lang w:val="en-US"/>
-        </w:rPr>
-        <w:t>greek</w:t>
-      </w:r>
-      <w:proofErr w:type="spellEnd"/>
-      <w:r>
-        <w:rPr>
-          <w:rFonts w:ascii="Trebuchet MS" w:hAnsi="Trebuchet MS"/>
-          <w:sz w:val="20"/>
-          <w:szCs w:val="20"/>
-          <w:lang w:val="en-US"/>
-        </w:rPr>
-        <w:t xml:space="preserve"> }</w:t>
-      </w:r>
+      <w:proofErr w:type="spellEnd"/>
       <w:proofErr w:type="gramEnd"/>
-      <w:r>
-        <w:rPr>
-          <w:rFonts w:ascii="Trebuchet MS" w:hAnsi="Trebuchet MS"/>
-          <w:sz w:val="20"/>
-          <w:szCs w:val="20"/>
-          <w:lang w:val="en-US"/>
-        </w:rPr>
-        <w:t xml:space="preserve">}, </w:t>
-      </w:r>
       <w:proofErr w:type="gramStart"/>
-      <w:r>
-        <w:rPr>
-          <w:rFonts w:ascii="Trebuchet MS" w:hAnsi="Trebuchet MS"/>
-          <w:sz w:val="20"/>
-          <w:szCs w:val="20"/>
-          <w:lang w:val="en-US"/>
-        </w:rPr>
-        <w:t xml:space="preserve">{{ </w:t>
-      </w:r>
-      <w:proofErr w:type="spellStart"/>
-      <w:r>
-        <w:rPr>
-          <w:rFonts w:ascii="Trebuchet MS" w:hAnsi="Trebuchet MS"/>
-          <w:sz w:val="20"/>
-          <w:szCs w:val="20"/>
-          <w:lang w:val="en-US"/>
-        </w:rPr>
-        <w:t>property</w:t>
-      </w:r>
+      <w:proofErr w:type="spellStart"/>
       <w:proofErr w:type="gramEnd"/>
-      <w:r>
-        <w:rPr>
-          <w:rFonts w:ascii="Trebuchet MS" w:hAnsi="Trebuchet MS"/>
-          <w:sz w:val="20"/>
-          <w:szCs w:val="20"/>
-          <w:lang w:val="en-US"/>
-        </w:rPr>
-        <w:t>_province</w:t>
-      </w:r>
-      <w:r>
-        <w:rPr>
-          <w:rFonts w:ascii="Trebuchet MS" w:hAnsi="Trebuchet MS"/>
-          <w:sz w:val="20"/>
-          <w:szCs w:val="20"/>
-          <w:lang w:val="en-US"/>
-        </w:rPr>
-        <w:t>_</w:t>
-      </w:r>
       <w:proofErr w:type="gramStart"/>
-      <w:r>
-        <w:rPr>
-          <w:rFonts w:ascii="Trebuchet MS" w:hAnsi="Trebuchet MS"/>
-          <w:sz w:val="20"/>
-          <w:szCs w:val="20"/>
-          <w:lang w:val="en-US"/>
-        </w:rPr>
-        <w:t>greek</w:t>
-      </w:r>
-      <w:proofErr w:type="spellEnd"/>
-      <w:r>
-        <w:rPr>
-          <w:rFonts w:ascii="Trebuchet MS" w:hAnsi="Trebuchet MS"/>
-          <w:sz w:val="20"/>
-          <w:szCs w:val="20"/>
-          <w:lang w:val="en-US"/>
-        </w:rPr>
-        <w:t xml:space="preserve"> }</w:t>
-      </w:r>
+      <w:proofErr w:type="spellEnd"/>
       <w:proofErr w:type="gramEnd"/>
-      <w:r>
-        <w:rPr>
-          <w:rFonts w:ascii="Trebuchet MS" w:hAnsi="Trebuchet MS"/>
-          <w:sz w:val="20"/>
-          <w:szCs w:val="20"/>
-          <w:lang w:val="en-US"/>
-        </w:rPr>
-        <w:t xml:space="preserve">}, </w:t>
-      </w:r>
       <w:proofErr w:type="gramStart"/>
-      <w:r>
-        <w:rPr>
-          <w:rFonts w:ascii="Trebuchet MS" w:hAnsi="Trebuchet MS"/>
-          <w:sz w:val="20"/>
-          <w:szCs w:val="20"/>
-          <w:lang w:val="en-US"/>
-        </w:rPr>
-        <w:t xml:space="preserve">{{ </w:t>
-      </w:r>
-      <w:proofErr w:type="spellStart"/>
-      <w:r>
-        <w:rPr>
-          <w:rFonts w:ascii="Trebuchet MS" w:hAnsi="Trebuchet MS"/>
-          <w:sz w:val="20"/>
-          <w:szCs w:val="20"/>
-          <w:lang w:val="en-US"/>
-        </w:rPr>
-        <w:t>property</w:t>
-      </w:r>
+      <w:proofErr w:type="spellStart"/>
       <w:proofErr w:type="gramEnd"/>
-      <w:r>
-        <w:rPr>
-          <w:rFonts w:ascii="Trebuchet MS" w:hAnsi="Trebuchet MS"/>
-          <w:sz w:val="20"/>
-          <w:szCs w:val="20"/>
-          <w:lang w:val="en-US"/>
-        </w:rPr>
-        <w:t>_</w:t>
-      </w:r>
       <w:proofErr w:type="gramStart"/>
-      <w:r>
-        <w:rPr>
-          <w:rFonts w:ascii="Trebuchet MS" w:hAnsi="Trebuchet MS"/>
-          <w:sz w:val="20"/>
-          <w:szCs w:val="20"/>
-          <w:lang w:val="en-US"/>
-        </w:rPr>
-        <w:t>pcode</w:t>
-      </w:r>
-      <w:proofErr w:type="spellEnd"/>
-      <w:r>
-        <w:rPr>
-          <w:rFonts w:ascii="Trebuchet MS" w:hAnsi="Trebuchet MS"/>
-          <w:sz w:val="20"/>
-          <w:szCs w:val="20"/>
-          <w:lang w:val="en-US"/>
-        </w:rPr>
-        <w:t xml:space="preserve"> }</w:t>
-      </w:r>
+      <w:proofErr w:type="spellEnd"/>
       <w:proofErr w:type="gramEnd"/>
-      <w:r>
-        <w:rPr>
-          <w:rFonts w:ascii="Trebuchet MS" w:hAnsi="Trebuchet MS"/>
-          <w:sz w:val="20"/>
-          <w:szCs w:val="20"/>
-          <w:lang w:val="en-US"/>
-        </w:rPr>
-        <w:t>}</w:t>
-      </w:r>
     </w:p>
     <w:p>
       <w:pPr>

</xml_diff>